<commit_message>
just tweaked a the image read as byt and also added form-data in post man and then corrected abstraction override in GetX and also created flutter packages part two for future use
</commit_message>
<xml_diff>
--- a/flutter more documents/f18_postman_basics.docx
+++ b/flutter more documents/f18_postman_basics.docx
@@ -163,7 +163,7 @@
                     </pic:cNvPicPr>
                   </pic:nvPicPr>
                   <pic:blipFill>
-                    <a:blip r:embed="rId4" cstate="print">
+                    <a:blip r:embed="rId6" cstate="print">
                       <a:extLst>
                         <a:ext uri="{28A0092B-C50C-407E-A947-70E740481C1C}">
                           <a14:useLocalDpi xmlns:a14="http://schemas.microsoft.com/office/drawing/2010/main" val="0"/>
@@ -361,7 +361,7 @@
                     </pic:cNvPicPr>
                   </pic:nvPicPr>
                   <pic:blipFill>
-                    <a:blip r:embed="rId5">
+                    <a:blip r:embed="rId7">
                       <a:extLst>
                         <a:ext uri="{28A0092B-C50C-407E-A947-70E740481C1C}">
                           <a14:useLocalDpi xmlns:a14="http://schemas.microsoft.com/office/drawing/2010/main" val="0"/>
@@ -492,7 +492,7 @@
                     </pic:cNvPicPr>
                   </pic:nvPicPr>
                   <pic:blipFill>
-                    <a:blip r:embed="rId6">
+                    <a:blip r:embed="rId8">
                       <a:extLst>
                         <a:ext uri="{28A0092B-C50C-407E-A947-70E740481C1C}">
                           <a14:useLocalDpi xmlns:a14="http://schemas.microsoft.com/office/drawing/2010/main" val="0"/>
@@ -684,7 +684,7 @@
           <w:noProof/>
         </w:rPr>
         <w:drawing>
-          <wp:anchor distT="0" distB="0" distL="114300" distR="114300" simplePos="0" relativeHeight="251661312" behindDoc="0" locked="0" layoutInCell="1" allowOverlap="1" wp14:anchorId="71319E98" wp14:editId="5A4F5D75">
+          <wp:anchor distT="0" distB="0" distL="114300" distR="114300" simplePos="0" relativeHeight="251661312" behindDoc="0" locked="0" layoutInCell="1" allowOverlap="1" wp14:anchorId="71319E98" wp14:editId="589B4B04">
             <wp:simplePos x="0" y="0"/>
             <wp:positionH relativeFrom="margin">
               <wp:align>center</wp:align>
@@ -709,7 +709,7 @@
                     </pic:cNvPicPr>
                   </pic:nvPicPr>
                   <pic:blipFill>
-                    <a:blip r:embed="rId7" cstate="print">
+                    <a:blip r:embed="rId9" cstate="print">
                       <a:extLst>
                         <a:ext uri="{28A0092B-C50C-407E-A947-70E740481C1C}">
                           <a14:useLocalDpi xmlns:a14="http://schemas.microsoft.com/office/drawing/2010/main" val="0"/>
@@ -910,7 +910,7 @@
           <w:noProof/>
         </w:rPr>
         <w:drawing>
-          <wp:anchor distT="0" distB="0" distL="114300" distR="114300" simplePos="0" relativeHeight="251662336" behindDoc="0" locked="0" layoutInCell="1" allowOverlap="1" wp14:anchorId="15467FBA" wp14:editId="4C66F27A">
+          <wp:anchor distT="0" distB="0" distL="114300" distR="114300" simplePos="0" relativeHeight="251662336" behindDoc="0" locked="0" layoutInCell="1" allowOverlap="1" wp14:anchorId="15467FBA" wp14:editId="0C529E9B">
             <wp:simplePos x="0" y="0"/>
             <wp:positionH relativeFrom="margin">
               <wp:align>right</wp:align>
@@ -935,7 +935,7 @@
                     </pic:cNvPicPr>
                   </pic:nvPicPr>
                   <pic:blipFill>
-                    <a:blip r:embed="rId8" cstate="print">
+                    <a:blip r:embed="rId10" cstate="print">
                       <a:extLst>
                         <a:ext uri="{28A0092B-C50C-407E-A947-70E740481C1C}">
                           <a14:useLocalDpi xmlns:a14="http://schemas.microsoft.com/office/drawing/2010/main" val="0"/>
@@ -1315,6 +1315,7 @@
       </w:pPr>
       <w:r>
         <w:rPr>
+          <w:noProof/>
           <w:sz w:val="36"/>
           <w:szCs w:val="36"/>
         </w:rPr>
@@ -1342,7 +1343,7 @@
                     <pic:cNvPicPr/>
                   </pic:nvPicPr>
                   <pic:blipFill>
-                    <a:blip r:embed="rId9">
+                    <a:blip r:embed="rId11">
                       <a:extLst>
                         <a:ext uri="{28A0092B-C50C-407E-A947-70E740481C1C}">
                           <a14:useLocalDpi xmlns:a14="http://schemas.microsoft.com/office/drawing/2010/main" val="0"/>
@@ -1491,7 +1492,7 @@
                     </pic:cNvPicPr>
                   </pic:nvPicPr>
                   <pic:blipFill>
-                    <a:blip r:embed="rId10" cstate="print">
+                    <a:blip r:embed="rId12" cstate="print">
                       <a:extLst>
                         <a:ext uri="{28A0092B-C50C-407E-A947-70E740481C1C}">
                           <a14:useLocalDpi xmlns:a14="http://schemas.microsoft.com/office/drawing/2010/main" val="0"/>
@@ -1799,7 +1800,7 @@
                     </pic:cNvPicPr>
                   </pic:nvPicPr>
                   <pic:blipFill>
-                    <a:blip r:embed="rId11" cstate="print">
+                    <a:blip r:embed="rId13" cstate="print">
                       <a:extLst>
                         <a:ext uri="{28A0092B-C50C-407E-A947-70E740481C1C}">
                           <a14:useLocalDpi xmlns:a14="http://schemas.microsoft.com/office/drawing/2010/main" val="0"/>
@@ -2070,6 +2071,7 @@
       </w:pPr>
       <w:r>
         <w:rPr>
+          <w:noProof/>
           <w:sz w:val="36"/>
           <w:szCs w:val="36"/>
         </w:rPr>
@@ -2097,7 +2099,7 @@
                     <pic:cNvPicPr/>
                   </pic:nvPicPr>
                   <pic:blipFill>
-                    <a:blip r:embed="rId12">
+                    <a:blip r:embed="rId14">
                       <a:extLst>
                         <a:ext uri="{28A0092B-C50C-407E-A947-70E740481C1C}">
                           <a14:useLocalDpi xmlns:a14="http://schemas.microsoft.com/office/drawing/2010/main" val="0"/>
@@ -2146,7 +2148,694 @@
         </w:rPr>
       </w:pPr>
     </w:p>
+    <w:p>
+      <w:pPr>
+        <w:rPr>
+          <w:sz w:val="36"/>
+          <w:szCs w:val="36"/>
+        </w:rPr>
+      </w:pPr>
+    </w:p>
+    <w:p>
+      <w:pPr>
+        <w:rPr>
+          <w:sz w:val="36"/>
+          <w:szCs w:val="36"/>
+        </w:rPr>
+      </w:pPr>
+    </w:p>
+    <w:p>
+      <w:pPr>
+        <w:rPr>
+          <w:sz w:val="36"/>
+          <w:szCs w:val="36"/>
+        </w:rPr>
+      </w:pPr>
+    </w:p>
+    <w:p>
+      <w:pPr>
+        <w:rPr>
+          <w:sz w:val="36"/>
+          <w:szCs w:val="36"/>
+        </w:rPr>
+      </w:pPr>
+    </w:p>
+    <w:p>
+      <w:pPr>
+        <w:rPr>
+          <w:b/>
+          <w:bCs/>
+          <w:sz w:val="36"/>
+          <w:szCs w:val="36"/>
+        </w:rPr>
+      </w:pPr>
+      <w:r>
+        <w:rPr>
+          <w:b/>
+          <w:bCs/>
+          <w:sz w:val="36"/>
+          <w:szCs w:val="36"/>
+        </w:rPr>
+        <w:t xml:space="preserve">Form Data in </w:t>
+      </w:r>
+      <w:proofErr w:type="spellStart"/>
+      <w:r>
+        <w:rPr>
+          <w:b/>
+          <w:bCs/>
+          <w:sz w:val="36"/>
+          <w:szCs w:val="36"/>
+        </w:rPr>
+        <w:t>PostMan</w:t>
+      </w:r>
+      <w:proofErr w:type="spellEnd"/>
+      <w:r>
+        <w:rPr>
+          <w:b/>
+          <w:bCs/>
+          <w:sz w:val="36"/>
+          <w:szCs w:val="36"/>
+        </w:rPr>
+        <w:t>:</w:t>
+      </w:r>
+    </w:p>
+    <w:p>
+      <w:pPr>
+        <w:rPr>
+          <w:sz w:val="36"/>
+          <w:szCs w:val="36"/>
+        </w:rPr>
+      </w:pPr>
+      <w:r>
+        <w:rPr>
+          <w:sz w:val="36"/>
+          <w:szCs w:val="36"/>
+        </w:rPr>
+        <w:t xml:space="preserve"># </w:t>
+      </w:r>
+      <w:r>
+        <w:rPr>
+          <w:sz w:val="36"/>
+          <w:szCs w:val="36"/>
+        </w:rPr>
+        <w:t>We can send multiple types of data like normal fields as key-value pair and photo files too with it</w:t>
+      </w:r>
+      <w:r>
+        <w:rPr>
+          <w:sz w:val="36"/>
+          <w:szCs w:val="36"/>
+        </w:rPr>
+        <w:t>.</w:t>
+      </w:r>
+    </w:p>
+    <w:p>
+      <w:pPr>
+        <w:rPr>
+          <w:sz w:val="36"/>
+          <w:szCs w:val="36"/>
+        </w:rPr>
+      </w:pPr>
+      <w:r>
+        <w:rPr>
+          <w:sz w:val="36"/>
+          <w:szCs w:val="36"/>
+        </w:rPr>
+        <w:t># Just go to</w:t>
+      </w:r>
+      <w:r>
+        <w:rPr>
+          <w:b/>
+          <w:bCs/>
+          <w:sz w:val="36"/>
+          <w:szCs w:val="36"/>
+        </w:rPr>
+        <w:t xml:space="preserve"> body</w:t>
+      </w:r>
+      <w:r>
+        <w:rPr>
+          <w:sz w:val="36"/>
+          <w:szCs w:val="36"/>
+        </w:rPr>
+        <w:t xml:space="preserve"> and then select </w:t>
+      </w:r>
+      <w:r>
+        <w:rPr>
+          <w:b/>
+          <w:bCs/>
+          <w:sz w:val="36"/>
+          <w:szCs w:val="36"/>
+        </w:rPr>
+        <w:t>form-data</w:t>
+      </w:r>
+      <w:r>
+        <w:rPr>
+          <w:sz w:val="36"/>
+          <w:szCs w:val="36"/>
+        </w:rPr>
+        <w:t xml:space="preserve">. Then simply </w:t>
+      </w:r>
+      <w:r>
+        <w:rPr>
+          <w:sz w:val="36"/>
+          <w:szCs w:val="36"/>
+        </w:rPr>
+        <w:t xml:space="preserve">click on </w:t>
+      </w:r>
+      <w:r>
+        <w:rPr>
+          <w:b/>
+          <w:bCs/>
+          <w:sz w:val="36"/>
+          <w:szCs w:val="36"/>
+        </w:rPr>
+        <w:t>Text</w:t>
+      </w:r>
+      <w:r>
+        <w:rPr>
+          <w:sz w:val="36"/>
+          <w:szCs w:val="36"/>
+        </w:rPr>
+        <w:t xml:space="preserve"> and select</w:t>
+      </w:r>
+      <w:r>
+        <w:rPr>
+          <w:b/>
+          <w:bCs/>
+          <w:sz w:val="36"/>
+          <w:szCs w:val="36"/>
+        </w:rPr>
+        <w:t xml:space="preserve"> File</w:t>
+      </w:r>
+      <w:r>
+        <w:rPr>
+          <w:sz w:val="36"/>
+          <w:szCs w:val="36"/>
+        </w:rPr>
+        <w:t>. Just like that we can upload files or photos to the API or Backend.</w:t>
+      </w:r>
+    </w:p>
+    <w:p>
+      <w:pPr>
+        <w:rPr>
+          <w:sz w:val="36"/>
+          <w:szCs w:val="36"/>
+        </w:rPr>
+      </w:pPr>
+      <w:r>
+        <w:rPr>
+          <w:sz w:val="36"/>
+          <w:szCs w:val="36"/>
+        </w:rPr>
+        <w:t># The server will save the image and give us a URL of the image which will be then show in the fronted. We can also only upload image here</w:t>
+      </w:r>
+    </w:p>
+    <w:p>
+      <w:pPr>
+        <w:rPr>
+          <w:sz w:val="36"/>
+          <w:szCs w:val="36"/>
+        </w:rPr>
+      </w:pPr>
+      <w:r>
+        <w:rPr>
+          <w:sz w:val="36"/>
+          <w:szCs w:val="36"/>
+        </w:rPr>
+        <w:drawing>
+          <wp:anchor distT="0" distB="0" distL="114300" distR="114300" simplePos="0" relativeHeight="251667456" behindDoc="1" locked="0" layoutInCell="1" allowOverlap="1" wp14:anchorId="0D82B111" wp14:editId="3E316545">
+            <wp:simplePos x="0" y="0"/>
+            <wp:positionH relativeFrom="margin">
+              <wp:align>right</wp:align>
+            </wp:positionH>
+            <wp:positionV relativeFrom="paragraph">
+              <wp:posOffset>8890</wp:posOffset>
+            </wp:positionV>
+            <wp:extent cx="5731510" cy="3049905"/>
+            <wp:effectExtent l="0" t="0" r="2540" b="0"/>
+            <wp:wrapNone/>
+            <wp:docPr id="10" name="Picture 10"/>
+            <wp:cNvGraphicFramePr>
+              <a:graphicFrameLocks xmlns:a="http://schemas.openxmlformats.org/drawingml/2006/main" noChangeAspect="1"/>
+            </wp:cNvGraphicFramePr>
+            <a:graphic xmlns:a="http://schemas.openxmlformats.org/drawingml/2006/main">
+              <a:graphicData uri="http://schemas.openxmlformats.org/drawingml/2006/picture">
+                <pic:pic xmlns:pic="http://schemas.openxmlformats.org/drawingml/2006/picture">
+                  <pic:nvPicPr>
+                    <pic:cNvPr id="1" name=""/>
+                    <pic:cNvPicPr/>
+                  </pic:nvPicPr>
+                  <pic:blipFill>
+                    <a:blip r:embed="rId15" cstate="print">
+                      <a:extLst>
+                        <a:ext uri="{28A0092B-C50C-407E-A947-70E740481C1C}">
+                          <a14:useLocalDpi xmlns:a14="http://schemas.microsoft.com/office/drawing/2010/main" val="0"/>
+                        </a:ext>
+                      </a:extLst>
+                    </a:blip>
+                    <a:stretch>
+                      <a:fillRect/>
+                    </a:stretch>
+                  </pic:blipFill>
+                  <pic:spPr>
+                    <a:xfrm>
+                      <a:off x="0" y="0"/>
+                      <a:ext cx="5731510" cy="3049905"/>
+                    </a:xfrm>
+                    <a:prstGeom prst="rect">
+                      <a:avLst/>
+                    </a:prstGeom>
+                  </pic:spPr>
+                </pic:pic>
+              </a:graphicData>
+            </a:graphic>
+          </wp:anchor>
+        </w:drawing>
+      </w:r>
+    </w:p>
+    <w:p>
+      <w:pPr>
+        <w:rPr>
+          <w:sz w:val="36"/>
+          <w:szCs w:val="36"/>
+        </w:rPr>
+      </w:pPr>
+    </w:p>
+    <w:p>
+      <w:pPr>
+        <w:rPr>
+          <w:sz w:val="36"/>
+          <w:szCs w:val="36"/>
+        </w:rPr>
+      </w:pPr>
+    </w:p>
+    <w:p>
+      <w:pPr>
+        <w:rPr>
+          <w:sz w:val="36"/>
+          <w:szCs w:val="36"/>
+        </w:rPr>
+      </w:pPr>
+    </w:p>
+    <w:p>
+      <w:pPr>
+        <w:rPr>
+          <w:sz w:val="36"/>
+          <w:szCs w:val="36"/>
+        </w:rPr>
+      </w:pPr>
+    </w:p>
+    <w:p>
+      <w:pPr>
+        <w:rPr>
+          <w:sz w:val="36"/>
+          <w:szCs w:val="36"/>
+        </w:rPr>
+      </w:pPr>
+    </w:p>
+    <w:p>
+      <w:pPr>
+        <w:rPr>
+          <w:sz w:val="36"/>
+          <w:szCs w:val="36"/>
+        </w:rPr>
+      </w:pPr>
+    </w:p>
+    <w:p>
+      <w:pPr>
+        <w:rPr>
+          <w:sz w:val="36"/>
+          <w:szCs w:val="36"/>
+        </w:rPr>
+      </w:pPr>
+    </w:p>
+    <w:p>
+      <w:pPr>
+        <w:rPr>
+          <w:sz w:val="36"/>
+          <w:szCs w:val="36"/>
+        </w:rPr>
+      </w:pPr>
+    </w:p>
+    <w:p>
+      <w:pPr>
+        <w:rPr>
+          <w:b/>
+          <w:bCs/>
+          <w:sz w:val="36"/>
+          <w:szCs w:val="36"/>
+        </w:rPr>
+      </w:pPr>
+      <w:r>
+        <w:rPr>
+          <w:b/>
+          <w:bCs/>
+          <w:sz w:val="36"/>
+          <w:szCs w:val="36"/>
+        </w:rPr>
+        <w:t>x-www-form-</w:t>
+      </w:r>
+      <w:proofErr w:type="spellStart"/>
+      <w:r>
+        <w:rPr>
+          <w:b/>
+          <w:bCs/>
+          <w:sz w:val="36"/>
+          <w:szCs w:val="36"/>
+        </w:rPr>
+        <w:t>urlencoded</w:t>
+      </w:r>
+      <w:proofErr w:type="spellEnd"/>
+      <w:r>
+        <w:rPr>
+          <w:b/>
+          <w:bCs/>
+          <w:sz w:val="36"/>
+          <w:szCs w:val="36"/>
+        </w:rPr>
+        <w:t xml:space="preserve"> in Postman:</w:t>
+      </w:r>
+    </w:p>
+    <w:p>
+      <w:pPr>
+        <w:rPr>
+          <w:sz w:val="36"/>
+          <w:szCs w:val="36"/>
+        </w:rPr>
+      </w:pPr>
+      <w:r>
+        <w:rPr>
+          <w:sz w:val="36"/>
+          <w:szCs w:val="36"/>
+        </w:rPr>
+        <w:lastRenderedPageBreak/>
+        <w:t xml:space="preserve"># </w:t>
+      </w:r>
+      <w:r>
+        <w:rPr>
+          <w:b/>
+          <w:bCs/>
+          <w:sz w:val="36"/>
+          <w:szCs w:val="36"/>
+        </w:rPr>
+        <w:t>application/x-www-form-</w:t>
+      </w:r>
+      <w:proofErr w:type="spellStart"/>
+      <w:r>
+        <w:rPr>
+          <w:b/>
+          <w:bCs/>
+          <w:sz w:val="36"/>
+          <w:szCs w:val="36"/>
+        </w:rPr>
+        <w:t>urlencoded</w:t>
+      </w:r>
+      <w:proofErr w:type="spellEnd"/>
+      <w:r>
+        <w:rPr>
+          <w:sz w:val="36"/>
+          <w:szCs w:val="36"/>
+        </w:rPr>
+        <w:t xml:space="preserve"> is a Content-Type header used to send data to a server</w:t>
+      </w:r>
+      <w:r>
+        <w:rPr>
+          <w:sz w:val="36"/>
+          <w:szCs w:val="36"/>
+        </w:rPr>
+        <w:t xml:space="preserve"> and</w:t>
+      </w:r>
+      <w:r>
+        <w:rPr>
+          <w:sz w:val="36"/>
+          <w:szCs w:val="36"/>
+        </w:rPr>
+        <w:t xml:space="preserve"> is the default method used by HTML forms</w:t>
+      </w:r>
+      <w:r>
+        <w:rPr>
+          <w:sz w:val="36"/>
+          <w:szCs w:val="36"/>
+        </w:rPr>
+        <w:t xml:space="preserve">. </w:t>
+      </w:r>
+    </w:p>
+    <w:p>
+      <w:pPr>
+        <w:rPr>
+          <w:sz w:val="36"/>
+          <w:szCs w:val="36"/>
+        </w:rPr>
+      </w:pPr>
+      <w:r>
+        <w:rPr>
+          <w:sz w:val="36"/>
+          <w:szCs w:val="36"/>
+        </w:rPr>
+        <w:t xml:space="preserve"># </w:t>
+      </w:r>
+      <w:r>
+        <w:rPr>
+          <w:sz w:val="36"/>
+          <w:szCs w:val="36"/>
+        </w:rPr>
+        <w:t>Use</w:t>
+      </w:r>
+      <w:r>
+        <w:rPr>
+          <w:sz w:val="36"/>
+          <w:szCs w:val="36"/>
+        </w:rPr>
+        <w:t>ful when we</w:t>
+      </w:r>
+      <w:r>
+        <w:rPr>
+          <w:sz w:val="36"/>
+          <w:szCs w:val="36"/>
+        </w:rPr>
+        <w:t xml:space="preserve"> are building a simple website where a standard HTML &lt;form&gt; is submitting data.</w:t>
+      </w:r>
+    </w:p>
+    <w:p>
+      <w:pPr>
+        <w:rPr>
+          <w:sz w:val="36"/>
+          <w:szCs w:val="36"/>
+        </w:rPr>
+      </w:pPr>
+      <w:r>
+        <w:rPr>
+          <w:sz w:val="36"/>
+          <w:szCs w:val="36"/>
+        </w:rPr>
+        <w:t># Also needed when</w:t>
+      </w:r>
+      <w:r>
+        <w:rPr>
+          <w:sz w:val="36"/>
+          <w:szCs w:val="36"/>
+        </w:rPr>
+        <w:t xml:space="preserve"> integrating with older "legacy" APIs (like some OAuth2 implementations).</w:t>
+      </w:r>
+    </w:p>
+    <w:p>
+      <w:pPr>
+        <w:rPr>
+          <w:sz w:val="36"/>
+          <w:szCs w:val="36"/>
+        </w:rPr>
+      </w:pPr>
+      <w:r>
+        <w:rPr>
+          <w:sz w:val="36"/>
+          <w:szCs w:val="36"/>
+        </w:rPr>
+        <w:t># But a</w:t>
+      </w:r>
+      <w:r>
+        <w:rPr>
+          <w:sz w:val="36"/>
+          <w:szCs w:val="36"/>
+        </w:rPr>
+        <w:t xml:space="preserve">void it if </w:t>
+      </w:r>
+      <w:r>
+        <w:rPr>
+          <w:sz w:val="36"/>
+          <w:szCs w:val="36"/>
+        </w:rPr>
+        <w:t>we</w:t>
+      </w:r>
+      <w:r>
+        <w:rPr>
+          <w:sz w:val="36"/>
+          <w:szCs w:val="36"/>
+        </w:rPr>
+        <w:t xml:space="preserve"> need to send complex, nested data (like a list of objects). For that, use JSON.</w:t>
+      </w:r>
+      <w:r>
+        <w:rPr>
+          <w:sz w:val="36"/>
+          <w:szCs w:val="36"/>
+        </w:rPr>
+        <w:t xml:space="preserve"> Also a</w:t>
+      </w:r>
+      <w:r>
+        <w:rPr>
+          <w:sz w:val="36"/>
+          <w:szCs w:val="36"/>
+        </w:rPr>
+        <w:t xml:space="preserve">void it if </w:t>
+      </w:r>
+      <w:r>
+        <w:rPr>
+          <w:sz w:val="36"/>
+          <w:szCs w:val="36"/>
+        </w:rPr>
+        <w:t>we</w:t>
+      </w:r>
+      <w:r>
+        <w:rPr>
+          <w:sz w:val="36"/>
+          <w:szCs w:val="36"/>
+        </w:rPr>
+        <w:t xml:space="preserve"> need to upload a profile picture or a PDF. For that, use form-data.</w:t>
+      </w:r>
+    </w:p>
+    <w:p>
+      <w:pPr>
+        <w:rPr>
+          <w:sz w:val="36"/>
+          <w:szCs w:val="36"/>
+        </w:rPr>
+      </w:pPr>
+      <w:r>
+        <w:rPr>
+          <w:sz w:val="36"/>
+          <w:szCs w:val="36"/>
+        </w:rPr>
+        <w:drawing>
+          <wp:anchor distT="0" distB="0" distL="114300" distR="114300" simplePos="0" relativeHeight="251668480" behindDoc="1" locked="0" layoutInCell="1" allowOverlap="1" wp14:anchorId="4258DAEB" wp14:editId="1471B3D3">
+            <wp:simplePos x="0" y="0"/>
+            <wp:positionH relativeFrom="column">
+              <wp:posOffset>0</wp:posOffset>
+            </wp:positionH>
+            <wp:positionV relativeFrom="paragraph">
+              <wp:posOffset>635</wp:posOffset>
+            </wp:positionV>
+            <wp:extent cx="5731510" cy="2952115"/>
+            <wp:effectExtent l="0" t="0" r="2540" b="635"/>
+            <wp:wrapNone/>
+            <wp:docPr id="11" name="Picture 11"/>
+            <wp:cNvGraphicFramePr>
+              <a:graphicFrameLocks xmlns:a="http://schemas.openxmlformats.org/drawingml/2006/main" noChangeAspect="1"/>
+            </wp:cNvGraphicFramePr>
+            <a:graphic xmlns:a="http://schemas.openxmlformats.org/drawingml/2006/main">
+              <a:graphicData uri="http://schemas.openxmlformats.org/drawingml/2006/picture">
+                <pic:pic xmlns:pic="http://schemas.openxmlformats.org/drawingml/2006/picture">
+                  <pic:nvPicPr>
+                    <pic:cNvPr id="1" name=""/>
+                    <pic:cNvPicPr/>
+                  </pic:nvPicPr>
+                  <pic:blipFill>
+                    <a:blip r:embed="rId16" cstate="print">
+                      <a:extLst>
+                        <a:ext uri="{28A0092B-C50C-407E-A947-70E740481C1C}">
+                          <a14:useLocalDpi xmlns:a14="http://schemas.microsoft.com/office/drawing/2010/main" val="0"/>
+                        </a:ext>
+                      </a:extLst>
+                    </a:blip>
+                    <a:stretch>
+                      <a:fillRect/>
+                    </a:stretch>
+                  </pic:blipFill>
+                  <pic:spPr>
+                    <a:xfrm>
+                      <a:off x="0" y="0"/>
+                      <a:ext cx="5731510" cy="2952115"/>
+                    </a:xfrm>
+                    <a:prstGeom prst="rect">
+                      <a:avLst/>
+                    </a:prstGeom>
+                  </pic:spPr>
+                </pic:pic>
+              </a:graphicData>
+            </a:graphic>
+            <wp14:sizeRelH relativeFrom="page">
+              <wp14:pctWidth>0</wp14:pctWidth>
+            </wp14:sizeRelH>
+            <wp14:sizeRelV relativeFrom="page">
+              <wp14:pctHeight>0</wp14:pctHeight>
+            </wp14:sizeRelV>
+          </wp:anchor>
+        </w:drawing>
+      </w:r>
+    </w:p>
+    <w:p>
+      <w:pPr>
+        <w:rPr>
+          <w:sz w:val="36"/>
+          <w:szCs w:val="36"/>
+        </w:rPr>
+      </w:pPr>
+    </w:p>
+    <w:p>
+      <w:pPr>
+        <w:rPr>
+          <w:sz w:val="36"/>
+          <w:szCs w:val="36"/>
+        </w:rPr>
+      </w:pPr>
+    </w:p>
+    <w:p>
+      <w:pPr>
+        <w:rPr>
+          <w:sz w:val="36"/>
+          <w:szCs w:val="36"/>
+        </w:rPr>
+      </w:pPr>
+    </w:p>
+    <w:p>
+      <w:pPr>
+        <w:rPr>
+          <w:sz w:val="36"/>
+          <w:szCs w:val="36"/>
+        </w:rPr>
+      </w:pPr>
+    </w:p>
+    <w:p>
+      <w:pPr>
+        <w:rPr>
+          <w:sz w:val="36"/>
+          <w:szCs w:val="36"/>
+        </w:rPr>
+      </w:pPr>
+    </w:p>
+    <w:p>
+      <w:pPr>
+        <w:rPr>
+          <w:sz w:val="36"/>
+          <w:szCs w:val="36"/>
+        </w:rPr>
+      </w:pPr>
+    </w:p>
+    <w:p>
+      <w:pPr>
+        <w:rPr>
+          <w:sz w:val="36"/>
+          <w:szCs w:val="36"/>
+        </w:rPr>
+      </w:pPr>
+    </w:p>
+    <w:p>
+      <w:pPr>
+        <w:rPr>
+          <w:sz w:val="36"/>
+          <w:szCs w:val="36"/>
+        </w:rPr>
+      </w:pPr>
+    </w:p>
     <w:sectPr>
+      <w:footerReference w:type="default" r:id="rId17"/>
       <w:pgSz w:w="11906" w:h="16838" w:code="9"/>
       <w:pgMar w:top="1440" w:right="1440" w:bottom="1440" w:left="1440" w:header="720" w:footer="720" w:gutter="0"/>
       <w:cols w:space="720"/>
@@ -2154,6 +2843,109 @@
     </w:sectPr>
   </w:body>
 </w:document>
+</file>
+
+<file path=word/endnotes.xml><?xml version="1.0" encoding="utf-8"?>
+<w:endnotes xmlns:wpc="http://schemas.microsoft.com/office/word/2010/wordprocessingCanvas" xmlns:cx="http://schemas.microsoft.com/office/drawing/2014/chartex" xmlns:cx1="http://schemas.microsoft.com/office/drawing/2015/9/8/chartex" xmlns:cx2="http://schemas.microsoft.com/office/drawing/2015/10/21/chartex" xmlns:cx3="http://schemas.microsoft.com/office/drawing/2016/5/9/chartex" xmlns:cx4="http://schemas.microsoft.com/office/drawing/2016/5/10/chartex" xmlns:cx5="http://schemas.microsoft.com/office/drawing/2016/5/11/chartex" xmlns:cx6="http://schemas.microsoft.com/office/drawing/2016/5/12/chartex" xmlns:cx7="http://schemas.microsoft.com/office/drawing/2016/5/13/chartex" xmlns:cx8="http://schemas.microsoft.com/office/drawing/2016/5/14/chartex" xmlns:mc="http://schemas.openxmlformats.org/markup-compatibility/2006" xmlns:aink="http://schemas.microsoft.com/office/drawing/2016/ink" xmlns:am3d="http://schemas.microsoft.com/office/drawing/2017/model3d" xmlns:o="urn:schemas-microsoft-com:office:office" xmlns:oel="http://schemas.microsoft.com/office/2019/extlst" xmlns:r="http://schemas.openxmlformats.org/officeDocument/2006/relationships" xmlns:m="http://schemas.openxmlformats.org/officeDocument/2006/math" xmlns:v="urn:schemas-microsoft-com:vml" xmlns:wp14="http://schemas.microsoft.com/office/word/2010/wordprocessingDrawing" xmlns:wp="http://schemas.openxmlformats.org/drawingml/2006/wordprocessingDrawing" xmlns:w10="urn:schemas-microsoft-com:office:word" xmlns:w="http://schemas.openxmlformats.org/wordprocessingml/2006/main" xmlns:w14="http://schemas.microsoft.com/office/word/2010/wordml" xmlns:w15="http://schemas.microsoft.com/office/word/2012/wordml" xmlns:w16cex="http://schemas.microsoft.com/office/word/2018/wordml/cex" xmlns:w16cid="http://schemas.microsoft.com/office/word/2016/wordml/cid" xmlns:w16="http://schemas.microsoft.com/office/word/2018/wordml" xmlns:w16sdtdh="http://schemas.microsoft.com/office/word/2020/wordml/sdtdatahash" xmlns:w16se="http://schemas.microsoft.com/office/word/2015/wordml/symex" xmlns:wpg="http://schemas.microsoft.com/office/word/2010/wordprocessingGroup" xmlns:wpi="http://schemas.microsoft.com/office/word/2010/wordprocessingInk" xmlns:wne="http://schemas.microsoft.com/office/word/2006/wordml" xmlns:wps="http://schemas.microsoft.com/office/word/2010/wordprocessingShape" mc:Ignorable="w14 w15 w16se w16cid w16 w16cex w16sdtdh wp14">
+  <w:endnote w:type="separator" w:id="-1">
+    <w:p>
+      <w:pPr>
+        <w:spacing w:after="0" w:line="240" w:lineRule="auto"/>
+      </w:pPr>
+      <w:r>
+        <w:separator/>
+      </w:r>
+    </w:p>
+  </w:endnote>
+  <w:endnote w:type="continuationSeparator" w:id="0">
+    <w:p>
+      <w:pPr>
+        <w:spacing w:after="0" w:line="240" w:lineRule="auto"/>
+      </w:pPr>
+      <w:r>
+        <w:continuationSeparator/>
+      </w:r>
+    </w:p>
+  </w:endnote>
+</w:endnotes>
+</file>
+
+<file path=word/footer1.xml><?xml version="1.0" encoding="utf-8"?>
+<w:ftr xmlns:wpc="http://schemas.microsoft.com/office/word/2010/wordprocessingCanvas" xmlns:cx="http://schemas.microsoft.com/office/drawing/2014/chartex" xmlns:cx1="http://schemas.microsoft.com/office/drawing/2015/9/8/chartex" xmlns:cx2="http://schemas.microsoft.com/office/drawing/2015/10/21/chartex" xmlns:cx3="http://schemas.microsoft.com/office/drawing/2016/5/9/chartex" xmlns:cx4="http://schemas.microsoft.com/office/drawing/2016/5/10/chartex" xmlns:cx5="http://schemas.microsoft.com/office/drawing/2016/5/11/chartex" xmlns:cx6="http://schemas.microsoft.com/office/drawing/2016/5/12/chartex" xmlns:cx7="http://schemas.microsoft.com/office/drawing/2016/5/13/chartex" xmlns:cx8="http://schemas.microsoft.com/office/drawing/2016/5/14/chartex" xmlns:mc="http://schemas.openxmlformats.org/markup-compatibility/2006" xmlns:aink="http://schemas.microsoft.com/office/drawing/2016/ink" xmlns:am3d="http://schemas.microsoft.com/office/drawing/2017/model3d" xmlns:o="urn:schemas-microsoft-com:office:office" xmlns:oel="http://schemas.microsoft.com/office/2019/extlst" xmlns:r="http://schemas.openxmlformats.org/officeDocument/2006/relationships" xmlns:m="http://schemas.openxmlformats.org/officeDocument/2006/math" xmlns:v="urn:schemas-microsoft-com:vml" xmlns:wp14="http://schemas.microsoft.com/office/word/2010/wordprocessingDrawing" xmlns:wp="http://schemas.openxmlformats.org/drawingml/2006/wordprocessingDrawing" xmlns:w10="urn:schemas-microsoft-com:office:word" xmlns:w="http://schemas.openxmlformats.org/wordprocessingml/2006/main" xmlns:w14="http://schemas.microsoft.com/office/word/2010/wordml" xmlns:w15="http://schemas.microsoft.com/office/word/2012/wordml" xmlns:w16cex="http://schemas.microsoft.com/office/word/2018/wordml/cex" xmlns:w16cid="http://schemas.microsoft.com/office/word/2016/wordml/cid" xmlns:w16="http://schemas.microsoft.com/office/word/2018/wordml" xmlns:w16sdtdh="http://schemas.microsoft.com/office/word/2020/wordml/sdtdatahash" xmlns:w16se="http://schemas.microsoft.com/office/word/2015/wordml/symex" xmlns:wpg="http://schemas.microsoft.com/office/word/2010/wordprocessingGroup" xmlns:wpi="http://schemas.microsoft.com/office/word/2010/wordprocessingInk" xmlns:wne="http://schemas.microsoft.com/office/word/2006/wordml" xmlns:wps="http://schemas.microsoft.com/office/word/2010/wordprocessingShape" mc:Ignorable="w14 w15 w16se w16cid w16 w16cex w16sdtdh wp14">
+  <w:sdt>
+    <w:sdtPr>
+      <w:id w:val="-1751574642"/>
+      <w:docPartObj>
+        <w:docPartGallery w:val="Page Numbers (Bottom of Page)"/>
+        <w:docPartUnique/>
+      </w:docPartObj>
+    </w:sdtPr>
+    <w:sdtEndPr>
+      <w:rPr>
+        <w:noProof/>
+      </w:rPr>
+    </w:sdtEndPr>
+    <w:sdtContent>
+      <w:p>
+        <w:pPr>
+          <w:pStyle w:val="Footer"/>
+          <w:jc w:val="center"/>
+        </w:pPr>
+        <w:r>
+          <w:fldChar w:fldCharType="begin"/>
+        </w:r>
+        <w:r>
+          <w:instrText xml:space="preserve"> PAGE   \* MERGEFORMAT </w:instrText>
+        </w:r>
+        <w:r>
+          <w:fldChar w:fldCharType="separate"/>
+        </w:r>
+        <w:r>
+          <w:rPr>
+            <w:noProof/>
+          </w:rPr>
+          <w:t>2</w:t>
+        </w:r>
+        <w:r>
+          <w:rPr>
+            <w:noProof/>
+          </w:rPr>
+          <w:fldChar w:fldCharType="end"/>
+        </w:r>
+      </w:p>
+    </w:sdtContent>
+  </w:sdt>
+  <w:p>
+    <w:pPr>
+      <w:pStyle w:val="Footer"/>
+    </w:pPr>
+  </w:p>
+</w:ftr>
+</file>
+
+<file path=word/footnotes.xml><?xml version="1.0" encoding="utf-8"?>
+<w:footnotes xmlns:wpc="http://schemas.microsoft.com/office/word/2010/wordprocessingCanvas" xmlns:cx="http://schemas.microsoft.com/office/drawing/2014/chartex" xmlns:cx1="http://schemas.microsoft.com/office/drawing/2015/9/8/chartex" xmlns:cx2="http://schemas.microsoft.com/office/drawing/2015/10/21/chartex" xmlns:cx3="http://schemas.microsoft.com/office/drawing/2016/5/9/chartex" xmlns:cx4="http://schemas.microsoft.com/office/drawing/2016/5/10/chartex" xmlns:cx5="http://schemas.microsoft.com/office/drawing/2016/5/11/chartex" xmlns:cx6="http://schemas.microsoft.com/office/drawing/2016/5/12/chartex" xmlns:cx7="http://schemas.microsoft.com/office/drawing/2016/5/13/chartex" xmlns:cx8="http://schemas.microsoft.com/office/drawing/2016/5/14/chartex" xmlns:mc="http://schemas.openxmlformats.org/markup-compatibility/2006" xmlns:aink="http://schemas.microsoft.com/office/drawing/2016/ink" xmlns:am3d="http://schemas.microsoft.com/office/drawing/2017/model3d" xmlns:o="urn:schemas-microsoft-com:office:office" xmlns:oel="http://schemas.microsoft.com/office/2019/extlst" xmlns:r="http://schemas.openxmlformats.org/officeDocument/2006/relationships" xmlns:m="http://schemas.openxmlformats.org/officeDocument/2006/math" xmlns:v="urn:schemas-microsoft-com:vml" xmlns:wp14="http://schemas.microsoft.com/office/word/2010/wordprocessingDrawing" xmlns:wp="http://schemas.openxmlformats.org/drawingml/2006/wordprocessingDrawing" xmlns:w10="urn:schemas-microsoft-com:office:word" xmlns:w="http://schemas.openxmlformats.org/wordprocessingml/2006/main" xmlns:w14="http://schemas.microsoft.com/office/word/2010/wordml" xmlns:w15="http://schemas.microsoft.com/office/word/2012/wordml" xmlns:w16cex="http://schemas.microsoft.com/office/word/2018/wordml/cex" xmlns:w16cid="http://schemas.microsoft.com/office/word/2016/wordml/cid" xmlns:w16="http://schemas.microsoft.com/office/word/2018/wordml" xmlns:w16sdtdh="http://schemas.microsoft.com/office/word/2020/wordml/sdtdatahash" xmlns:w16se="http://schemas.microsoft.com/office/word/2015/wordml/symex" xmlns:wpg="http://schemas.microsoft.com/office/word/2010/wordprocessingGroup" xmlns:wpi="http://schemas.microsoft.com/office/word/2010/wordprocessingInk" xmlns:wne="http://schemas.microsoft.com/office/word/2006/wordml" xmlns:wps="http://schemas.microsoft.com/office/word/2010/wordprocessingShape" mc:Ignorable="w14 w15 w16se w16cid w16 w16cex w16sdtdh wp14">
+  <w:footnote w:type="separator" w:id="-1">
+    <w:p>
+      <w:pPr>
+        <w:spacing w:after="0" w:line="240" w:lineRule="auto"/>
+      </w:pPr>
+      <w:r>
+        <w:separator/>
+      </w:r>
+    </w:p>
+  </w:footnote>
+  <w:footnote w:type="continuationSeparator" w:id="0">
+    <w:p>
+      <w:pPr>
+        <w:spacing w:after="0" w:line="240" w:lineRule="auto"/>
+      </w:pPr>
+      <w:r>
+        <w:continuationSeparator/>
+      </w:r>
+    </w:p>
+  </w:footnote>
+</w:footnotes>
 </file>
 
 <file path=word/styles.xml><?xml version="1.0" encoding="utf-8"?>
@@ -2759,7 +3551,6 @@
   <w:style w:type="character" w:default="1" w:styleId="DefaultParagraphFont">
     <w:name w:val="Default Paragraph Font"/>
     <w:uiPriority w:val="1"/>
-    <w:semiHidden/>
     <w:unhideWhenUsed/>
   </w:style>
   <w:style w:type="table" w:default="1" w:styleId="TableNormal">
@@ -3073,6 +3864,50 @@
       <w:spacing w:val="5"/>
     </w:rPr>
   </w:style>
+  <w:style w:type="paragraph" w:styleId="Header">
+    <w:name w:val="header"/>
+    <w:basedOn w:val="Normal"/>
+    <w:link w:val="HeaderChar"/>
+    <w:uiPriority w:val="99"/>
+    <w:unhideWhenUsed/>
+    <w:rsid w:val="00CF4256"/>
+    <w:pPr>
+      <w:tabs>
+        <w:tab w:val="center" w:pos="4680"/>
+        <w:tab w:val="right" w:pos="9360"/>
+      </w:tabs>
+      <w:spacing w:after="0" w:line="240" w:lineRule="auto"/>
+    </w:pPr>
+  </w:style>
+  <w:style w:type="character" w:customStyle="1" w:styleId="HeaderChar">
+    <w:name w:val="Header Char"/>
+    <w:basedOn w:val="DefaultParagraphFont"/>
+    <w:link w:val="Header"/>
+    <w:uiPriority w:val="99"/>
+    <w:rsid w:val="00CF4256"/>
+  </w:style>
+  <w:style w:type="paragraph" w:styleId="Footer">
+    <w:name w:val="footer"/>
+    <w:basedOn w:val="Normal"/>
+    <w:link w:val="FooterChar"/>
+    <w:uiPriority w:val="99"/>
+    <w:unhideWhenUsed/>
+    <w:rsid w:val="00CF4256"/>
+    <w:pPr>
+      <w:tabs>
+        <w:tab w:val="center" w:pos="4680"/>
+        <w:tab w:val="right" w:pos="9360"/>
+      </w:tabs>
+      <w:spacing w:after="0" w:line="240" w:lineRule="auto"/>
+    </w:pPr>
+  </w:style>
+  <w:style w:type="character" w:customStyle="1" w:styleId="FooterChar">
+    <w:name w:val="Footer Char"/>
+    <w:basedOn w:val="DefaultParagraphFont"/>
+    <w:link w:val="Footer"/>
+    <w:uiPriority w:val="99"/>
+    <w:rsid w:val="00CF4256"/>
+  </w:style>
 </w:styles>
 </file>
 

</xml_diff>